<commit_message>
chore: sync local project before updater inspection
</commit_message>
<xml_diff>
--- a/操作指南.docx
+++ b/操作指南.docx
@@ -13,20 +13,36 @@
           <w:b/>
           <w:bCs/>
         </w:rPr>
-        <w:t xml:space="preserve"> XQBBPBox 操作指南</w:t>
-      </w:r>
-    </w:p>
-    <w:p>
-      <w:pPr>
-        <w:rPr>
-          <w:rFonts w:hint="eastAsia"/>
-        </w:rPr>
-      </w:pPr>
+        <w:t xml:space="preserve"> </w:t>
+      </w:r>
+      <w:proofErr w:type="spellStart"/>
       <w:r>
         <w:rPr>
           <w:b/>
           <w:bCs/>
         </w:rPr>
+        <w:t>XQBBPBox</w:t>
+      </w:r>
+      <w:proofErr w:type="spellEnd"/>
+      <w:r>
+        <w:rPr>
+          <w:b/>
+          <w:bCs/>
+        </w:rPr>
+        <w:t xml:space="preserve"> 操作指南</w:t>
+      </w:r>
+    </w:p>
+    <w:p>
+      <w:pPr>
+        <w:rPr>
+          <w:rFonts w:hint="eastAsia"/>
+        </w:rPr>
+      </w:pPr>
+      <w:r>
+        <w:rPr>
+          <w:b/>
+          <w:bCs/>
+        </w:rPr>
         <w:t xml:space="preserve"> 1. 软件启动</w:t>
       </w:r>
     </w:p>
@@ -37,7 +53,15 @@
         </w:rPr>
       </w:pPr>
       <w:r>
-        <w:t>1. 双击启动 XQBBPBox。</w:t>
+        <w:t xml:space="preserve">1. 双击启动 </w:t>
+      </w:r>
+      <w:proofErr w:type="spellStart"/>
+      <w:r>
+        <w:t>XQBBPBox</w:t>
+      </w:r>
+      <w:proofErr w:type="spellEnd"/>
+      <w:r>
+        <w:t>。</w:t>
       </w:r>
     </w:p>
     <w:p>
@@ -117,7 +141,15 @@
         </w:drawing>
       </w:r>
       <w:r>
-        <w:t>3. 左侧图标栏用于切换主要功能：</w:t>
+        <w:t>3. 左侧图标</w:t>
+      </w:r>
+      <w:proofErr w:type="gramStart"/>
+      <w:r>
+        <w:t>栏用于</w:t>
+      </w:r>
+      <w:proofErr w:type="gramEnd"/>
+      <w:r>
+        <w:t>切换主要功能：</w:t>
       </w:r>
     </w:p>
     <w:p>
@@ -403,7 +435,15 @@
         </w:rPr>
       </w:pPr>
       <w:r>
-        <w:t>    pick_sound/</w:t>
+        <w:t xml:space="preserve">    </w:t>
+      </w:r>
+      <w:proofErr w:type="spellStart"/>
+      <w:r>
+        <w:t>pick_sound</w:t>
+      </w:r>
+      <w:proofErr w:type="spellEnd"/>
+      <w:r>
+        <w:t>/</w:t>
       </w:r>
       <w:r>
         <w:rPr>
@@ -442,7 +482,7 @@
           <w:noProof/>
         </w:rPr>
         <w:drawing>
-          <wp:anchor distT="0" distB="0" distL="114300" distR="114300" simplePos="0" relativeHeight="251659264" behindDoc="0" locked="0" layoutInCell="1" allowOverlap="1" wp14:anchorId="3FF799A7" wp14:editId="63489D25">
+          <wp:anchor distT="0" distB="0" distL="114300" distR="114300" simplePos="0" relativeHeight="251659264" behindDoc="0" locked="0" layoutInCell="1" allowOverlap="1" wp14:anchorId="3FF799A7" wp14:editId="3FF83EEF">
             <wp:simplePos x="0" y="0"/>
             <wp:positionH relativeFrom="column">
               <wp:posOffset>2433055</wp:posOffset>
@@ -583,34 +623,9 @@
           <w:sz w:val="18"/>
           <w:szCs w:val="20"/>
         </w:rPr>
-        <w:t>#角色小图，用于ban位，配音轴显示等</w:t>
-      </w:r>
-    </w:p>
-    <w:p>
-      <w:pPr>
-        <w:rPr>
-          <w:rFonts w:hint="eastAsia"/>
-        </w:rPr>
-      </w:pPr>
-      <w:r>
-        <w:t>      ban_00001.png</w:t>
-      </w:r>
-    </w:p>
-    <w:p>
-      <w:pPr>
-        <w:rPr>
-          <w:rFonts w:hint="eastAsia"/>
-        </w:rPr>
-      </w:pPr>
-      <w:r>
-        <w:t>    left/</w:t>
-      </w:r>
-      <w:r>
-        <w:rPr>
-          <w:rFonts w:hint="eastAsia"/>
-        </w:rPr>
-        <w:t xml:space="preserve">    </w:t>
-      </w:r>
+        <w:t>#角色小图，用于ban位，配音</w:t>
+      </w:r>
+      <w:proofErr w:type="gramStart"/>
       <w:r>
         <w:rPr>
           <w:rFonts w:hint="eastAsia"/>
@@ -618,8 +633,9 @@
           <w:sz w:val="18"/>
           <w:szCs w:val="20"/>
         </w:rPr>
-        <w:t xml:space="preserve"> </w:t>
-      </w:r>
+        <w:t>轴显示</w:t>
+      </w:r>
+      <w:proofErr w:type="gramEnd"/>
       <w:r>
         <w:rPr>
           <w:rFonts w:hint="eastAsia"/>
@@ -627,7 +643,33 @@
           <w:sz w:val="18"/>
           <w:szCs w:val="20"/>
         </w:rPr>
-        <w:t xml:space="preserve"> </w:t>
+        <w:t>等</w:t>
+      </w:r>
+    </w:p>
+    <w:p>
+      <w:pPr>
+        <w:rPr>
+          <w:rFonts w:hint="eastAsia"/>
+        </w:rPr>
+      </w:pPr>
+      <w:r>
+        <w:t>      ban_00001.png</w:t>
+      </w:r>
+    </w:p>
+    <w:p>
+      <w:pPr>
+        <w:rPr>
+          <w:rFonts w:hint="eastAsia"/>
+        </w:rPr>
+      </w:pPr>
+      <w:r>
+        <w:t>    left/</w:t>
+      </w:r>
+      <w:r>
+        <w:rPr>
+          <w:rFonts w:hint="eastAsia"/>
+        </w:rPr>
+        <w:t xml:space="preserve">    </w:t>
       </w:r>
       <w:r>
         <w:rPr>
@@ -636,33 +678,7 @@
           <w:sz w:val="18"/>
           <w:szCs w:val="20"/>
         </w:rPr>
-        <w:t>#左侧选手pick角色时，在pick槽位显示的图片</w:t>
-      </w:r>
-    </w:p>
-    <w:p>
-      <w:pPr>
-        <w:rPr>
-          <w:rFonts w:hint="eastAsia"/>
-        </w:rPr>
-      </w:pPr>
-      <w:r>
-        <w:t>      left_00001.png</w:t>
-      </w:r>
-    </w:p>
-    <w:p>
-      <w:pPr>
-        <w:rPr>
-          <w:rFonts w:hint="eastAsia"/>
-        </w:rPr>
-      </w:pPr>
-      <w:r>
-        <w:t>    right/</w:t>
-      </w:r>
-      <w:r>
-        <w:rPr>
-          <w:rFonts w:hint="eastAsia"/>
-        </w:rPr>
-        <w:t xml:space="preserve">    </w:t>
+        <w:t xml:space="preserve"> </w:t>
       </w:r>
       <w:r>
         <w:rPr>
@@ -671,7 +687,7 @@
           <w:sz w:val="18"/>
           <w:szCs w:val="20"/>
         </w:rPr>
-        <w:t>#</w:t>
+        <w:t xml:space="preserve"> </w:t>
       </w:r>
       <w:r>
         <w:rPr>
@@ -680,7 +696,33 @@
           <w:sz w:val="18"/>
           <w:szCs w:val="20"/>
         </w:rPr>
-        <w:t>右</w:t>
+        <w:t>#左侧选手pick角色时，在pick槽位显示的图片</w:t>
+      </w:r>
+    </w:p>
+    <w:p>
+      <w:pPr>
+        <w:rPr>
+          <w:rFonts w:hint="eastAsia"/>
+        </w:rPr>
+      </w:pPr>
+      <w:r>
+        <w:t>      left_00001.png</w:t>
+      </w:r>
+    </w:p>
+    <w:p>
+      <w:pPr>
+        <w:rPr>
+          <w:rFonts w:hint="eastAsia"/>
+        </w:rPr>
+      </w:pPr>
+      <w:r>
+        <w:t>    right/</w:t>
+      </w:r>
+      <w:r>
+        <w:rPr>
+          <w:rFonts w:hint="eastAsia"/>
+        </w:rPr>
+        <w:t xml:space="preserve">    </w:t>
       </w:r>
       <w:r>
         <w:rPr>
@@ -689,49 +731,7 @@
           <w:sz w:val="18"/>
           <w:szCs w:val="20"/>
         </w:rPr>
-        <w:t>侧选手pick角色时，在pick槽位显示的图片</w:t>
-      </w:r>
-    </w:p>
-    <w:p>
-      <w:pPr>
-        <w:rPr>
-          <w:rFonts w:hint="eastAsia"/>
-        </w:rPr>
-      </w:pPr>
-      <w:r>
-        <w:t>      right_00001.png</w:t>
-      </w:r>
-    </w:p>
-    <w:p>
-      <w:pPr>
-        <w:rPr>
-          <w:rFonts w:hint="eastAsia"/>
-        </w:rPr>
-      </w:pPr>
-      <w:r>
-        <w:t>  videos/</w:t>
-      </w:r>
-      <w:r>
-        <w:rPr>
-          <w:rFonts w:hint="eastAsia"/>
-        </w:rPr>
-        <w:t xml:space="preserve">     </w:t>
-      </w:r>
-    </w:p>
-    <w:p>
-      <w:pPr>
-        <w:rPr>
-          <w:rFonts w:hint="eastAsia"/>
-        </w:rPr>
-      </w:pPr>
-      <w:r>
-        <w:t>    chant/</w:t>
-      </w:r>
-      <w:r>
-        <w:rPr>
-          <w:rFonts w:hint="eastAsia"/>
-        </w:rPr>
-        <w:t xml:space="preserve">   </w:t>
+        <w:t>#</w:t>
       </w:r>
       <w:r>
         <w:rPr>
@@ -740,7 +740,7 @@
           <w:sz w:val="18"/>
           <w:szCs w:val="20"/>
         </w:rPr>
-        <w:t>#</w:t>
+        <w:t>右</w:t>
       </w:r>
       <w:r>
         <w:rPr>
@@ -749,33 +749,49 @@
           <w:sz w:val="18"/>
           <w:szCs w:val="20"/>
         </w:rPr>
-        <w:t>选定角色时的唱名视频</w:t>
-      </w:r>
-    </w:p>
-    <w:p>
-      <w:pPr>
-        <w:rPr>
-          <w:rFonts w:hint="eastAsia"/>
-        </w:rPr>
-      </w:pPr>
-      <w:r>
-        <w:t>      chant_00001.png</w:t>
-      </w:r>
-    </w:p>
-    <w:p>
-      <w:pPr>
-        <w:rPr>
-          <w:rFonts w:hint="eastAsia"/>
-        </w:rPr>
-      </w:pPr>
-      <w:r>
-        <w:t>    PV/</w:t>
+        <w:t>侧选手pick角色时，在pick槽位显示的图片</w:t>
+      </w:r>
+    </w:p>
+    <w:p>
+      <w:pPr>
+        <w:rPr>
+          <w:rFonts w:hint="eastAsia"/>
+        </w:rPr>
+      </w:pPr>
+      <w:r>
+        <w:t>      right_00001.png</w:t>
+      </w:r>
+    </w:p>
+    <w:p>
+      <w:pPr>
+        <w:rPr>
+          <w:rFonts w:hint="eastAsia"/>
+        </w:rPr>
+      </w:pPr>
+      <w:r>
+        <w:t>  videos/</w:t>
       </w:r>
       <w:r>
         <w:rPr>
           <w:rFonts w:hint="eastAsia"/>
         </w:rPr>
         <w:t xml:space="preserve">     </w:t>
+      </w:r>
+    </w:p>
+    <w:p>
+      <w:pPr>
+        <w:rPr>
+          <w:rFonts w:hint="eastAsia"/>
+        </w:rPr>
+      </w:pPr>
+      <w:r>
+        <w:t>    chant/</w:t>
+      </w:r>
+      <w:r>
+        <w:rPr>
+          <w:rFonts w:hint="eastAsia"/>
+        </w:rPr>
+        <w:t xml:space="preserve">   </w:t>
       </w:r>
       <w:r>
         <w:rPr>
@@ -784,6 +800,50 @@
           <w:sz w:val="18"/>
           <w:szCs w:val="20"/>
         </w:rPr>
+        <w:t>#</w:t>
+      </w:r>
+      <w:r>
+        <w:rPr>
+          <w:rFonts w:hint="eastAsia"/>
+          <w:color w:val="00B050"/>
+          <w:sz w:val="18"/>
+          <w:szCs w:val="20"/>
+        </w:rPr>
+        <w:t>选定角色时的唱名视频</w:t>
+      </w:r>
+    </w:p>
+    <w:p>
+      <w:pPr>
+        <w:rPr>
+          <w:rFonts w:hint="eastAsia"/>
+        </w:rPr>
+      </w:pPr>
+      <w:r>
+        <w:t>      chant_00001.png</w:t>
+      </w:r>
+    </w:p>
+    <w:p>
+      <w:pPr>
+        <w:rPr>
+          <w:rFonts w:hint="eastAsia"/>
+        </w:rPr>
+      </w:pPr>
+      <w:r>
+        <w:t>    PV/</w:t>
+      </w:r>
+      <w:r>
+        <w:rPr>
+          <w:rFonts w:hint="eastAsia"/>
+        </w:rPr>
+        <w:t xml:space="preserve">     </w:t>
+      </w:r>
+      <w:r>
+        <w:rPr>
+          <w:rFonts w:hint="eastAsia"/>
+          <w:color w:val="00B050"/>
+          <w:sz w:val="18"/>
+          <w:szCs w:val="20"/>
+        </w:rPr>
         <w:t>#唱名视频播放后的PV视频，还有一个属性</w:t>
       </w:r>
     </w:p>
@@ -848,7 +908,15 @@
         </w:rPr>
       </w:pPr>
       <w:r>
-        <w:t xml:space="preserve"> pick_sound_编号.wav：角色 Pick 音效，会在 Pick 该角色时与 Pick 选定音效、角色 Pick 语音一起播放。</w:t>
+        <w:t xml:space="preserve"> </w:t>
+      </w:r>
+      <w:proofErr w:type="spellStart"/>
+      <w:r>
+        <w:t>pick_sound</w:t>
+      </w:r>
+      <w:proofErr w:type="spellEnd"/>
+      <w:r>
+        <w:t>_编号.wav：角色 Pick 音效，会在 Pick 该角色时与 Pick 选定音效、角色 Pick 语音一起播放。</w:t>
       </w:r>
     </w:p>
     <w:p>
@@ -1003,7 +1071,7 @@
         </w:rPr>
         <w:lastRenderedPageBreak/>
         <w:drawing>
-          <wp:anchor distT="0" distB="0" distL="114300" distR="114300" simplePos="0" relativeHeight="251661312" behindDoc="1" locked="0" layoutInCell="1" allowOverlap="1" wp14:anchorId="38EBBC42" wp14:editId="610A4D69">
+          <wp:anchor distT="0" distB="0" distL="114300" distR="114300" simplePos="0" relativeHeight="251661312" behindDoc="1" locked="0" layoutInCell="1" allowOverlap="1" wp14:anchorId="38EBBC42" wp14:editId="4C8FB3F9">
             <wp:simplePos x="0" y="0"/>
             <wp:positionH relativeFrom="margin">
               <wp:align>right</wp:align>
@@ -1368,68 +1436,114 @@
       </w:pPr>
       <w:r>
         <w:lastRenderedPageBreak/>
-        <w:t>assets/audios/pick_sound/pick_sound_编号.wav</w:t>
-      </w:r>
-    </w:p>
-    <w:p>
-      <w:pPr>
-        <w:rPr>
-          <w:rFonts w:hint="eastAsia"/>
-        </w:rPr>
-      </w:pPr>
-      <w:r>
-        <w:t>assets/characters/big/pick_编号.png</w:t>
-      </w:r>
-    </w:p>
-    <w:p>
-      <w:pPr>
-        <w:rPr>
-          <w:rFonts w:hint="eastAsia"/>
-        </w:rPr>
-      </w:pPr>
-      <w:r>
-        <w:t>assets/characters/small/ban_编号.png</w:t>
-      </w:r>
-    </w:p>
-    <w:p>
-      <w:pPr>
-        <w:rPr>
-          <w:rFonts w:hint="eastAsia"/>
-        </w:rPr>
-      </w:pPr>
-      <w:r>
-        <w:t>assets/characters/right/right_编号.png</w:t>
-      </w:r>
-    </w:p>
-    <w:p>
-      <w:pPr>
-        <w:rPr>
-          <w:rFonts w:hint="eastAsia"/>
-        </w:rPr>
-      </w:pPr>
-      <w:r>
-        <w:t>assets/characters/left/left_编号.png</w:t>
-      </w:r>
-    </w:p>
-    <w:p>
-      <w:pPr>
-        <w:rPr>
-          <w:rFonts w:hint="eastAsia"/>
-        </w:rPr>
-      </w:pPr>
-      <w:r>
-        <w:t>assets/videos/chant/chant_编号.png</w:t>
-      </w:r>
-    </w:p>
-    <w:p>
-      <w:pPr>
-        <w:rPr>
-          <w:rFonts w:hint="eastAsia"/>
-        </w:rPr>
-      </w:pPr>
-      <w:r>
-        <w:t>assets/videos/PV/PV_编号.png</w:t>
-      </w:r>
+        <w:t>assets/audios/</w:t>
+      </w:r>
+      <w:proofErr w:type="spellStart"/>
+      <w:r>
+        <w:t>pick_sound</w:t>
+      </w:r>
+      <w:proofErr w:type="spellEnd"/>
+      <w:r>
+        <w:t>/</w:t>
+      </w:r>
+      <w:proofErr w:type="spellStart"/>
+      <w:r>
+        <w:t>pick_sound</w:t>
+      </w:r>
+      <w:proofErr w:type="spellEnd"/>
+      <w:r>
+        <w:t>_编号.wav</w:t>
+      </w:r>
+    </w:p>
+    <w:p>
+      <w:pPr>
+        <w:rPr>
+          <w:rFonts w:hint="eastAsia"/>
+        </w:rPr>
+      </w:pPr>
+      <w:r>
+        <w:t>assets/characters/big/pick_编号.</w:t>
+      </w:r>
+      <w:proofErr w:type="spellStart"/>
+      <w:r>
+        <w:t>png</w:t>
+      </w:r>
+      <w:proofErr w:type="spellEnd"/>
+    </w:p>
+    <w:p>
+      <w:pPr>
+        <w:rPr>
+          <w:rFonts w:hint="eastAsia"/>
+        </w:rPr>
+      </w:pPr>
+      <w:r>
+        <w:t>assets/characters/small/ban_编号.</w:t>
+      </w:r>
+      <w:proofErr w:type="spellStart"/>
+      <w:r>
+        <w:t>png</w:t>
+      </w:r>
+      <w:proofErr w:type="spellEnd"/>
+    </w:p>
+    <w:p>
+      <w:pPr>
+        <w:rPr>
+          <w:rFonts w:hint="eastAsia"/>
+        </w:rPr>
+      </w:pPr>
+      <w:r>
+        <w:t>assets/characters/right/right_编号.</w:t>
+      </w:r>
+      <w:proofErr w:type="spellStart"/>
+      <w:r>
+        <w:t>png</w:t>
+      </w:r>
+      <w:proofErr w:type="spellEnd"/>
+    </w:p>
+    <w:p>
+      <w:pPr>
+        <w:rPr>
+          <w:rFonts w:hint="eastAsia"/>
+        </w:rPr>
+      </w:pPr>
+      <w:r>
+        <w:t>assets/characters/left/left_编号.</w:t>
+      </w:r>
+      <w:proofErr w:type="spellStart"/>
+      <w:r>
+        <w:t>png</w:t>
+      </w:r>
+      <w:proofErr w:type="spellEnd"/>
+    </w:p>
+    <w:p>
+      <w:pPr>
+        <w:rPr>
+          <w:rFonts w:hint="eastAsia"/>
+        </w:rPr>
+      </w:pPr>
+      <w:r>
+        <w:t>assets/videos/chant/chant_编号.</w:t>
+      </w:r>
+      <w:proofErr w:type="spellStart"/>
+      <w:r>
+        <w:t>png</w:t>
+      </w:r>
+      <w:proofErr w:type="spellEnd"/>
+    </w:p>
+    <w:p>
+      <w:pPr>
+        <w:rPr>
+          <w:rFonts w:hint="eastAsia"/>
+        </w:rPr>
+      </w:pPr>
+      <w:r>
+        <w:t>assets/videos/PV/PV_编号.</w:t>
+      </w:r>
+      <w:proofErr w:type="spellStart"/>
+      <w:r>
+        <w:t>png</w:t>
+      </w:r>
+      <w:proofErr w:type="spellEnd"/>
     </w:p>
     <w:p>
       <w:pPr>
@@ -1647,9 +1761,11 @@
         </w:rPr>
         <w:t xml:space="preserve">  </w:t>
       </w:r>
+      <w:proofErr w:type="spellStart"/>
       <w:r>
         <w:t>lightcones</w:t>
       </w:r>
+      <w:proofErr w:type="spellEnd"/>
       <w:r>
         <w:rPr>
           <w:rFonts w:hint="eastAsia"/>
@@ -2038,7 +2154,7 @@
           <w:noProof/>
         </w:rPr>
         <w:drawing>
-          <wp:anchor distT="0" distB="0" distL="114300" distR="114300" simplePos="0" relativeHeight="251664384" behindDoc="0" locked="0" layoutInCell="1" allowOverlap="1" wp14:anchorId="5C915A62" wp14:editId="20791AEA">
+          <wp:anchor distT="0" distB="0" distL="114300" distR="114300" simplePos="0" relativeHeight="251664384" behindDoc="0" locked="0" layoutInCell="1" allowOverlap="1" wp14:anchorId="5C915A62" wp14:editId="6BEF0B41">
             <wp:simplePos x="0" y="0"/>
             <wp:positionH relativeFrom="margin">
               <wp:align>right</wp:align>
@@ -2114,7 +2230,15 @@
         </w:rPr>
       </w:pPr>
       <w:r>
-        <w:t>3. 当前流程会应用到 BP 和展示页设置中。</w:t>
+        <w:t>3. 当前流程会应用到 BP 和展示</w:t>
+      </w:r>
+      <w:proofErr w:type="gramStart"/>
+      <w:r>
+        <w:t>页设置</w:t>
+      </w:r>
+      <w:proofErr w:type="gramEnd"/>
+      <w:r>
+        <w:t>中。</w:t>
       </w:r>
     </w:p>
     <w:p>
@@ -2201,12 +2325,20 @@
           <w:rFonts w:hint="eastAsia"/>
         </w:rPr>
       </w:pPr>
+      <w:proofErr w:type="gramStart"/>
       <w:r>
         <w:rPr>
           <w:rFonts w:hint="eastAsia"/>
         </w:rPr>
         <w:lastRenderedPageBreak/>
-        <w:t>列如：</w:t>
+        <w:t>列如</w:t>
+      </w:r>
+      <w:proofErr w:type="gramEnd"/>
+      <w:r>
+        <w:rPr>
+          <w:rFonts w:hint="eastAsia"/>
+        </w:rPr>
+        <w:t>：</w:t>
       </w:r>
     </w:p>
     <w:p>
@@ -2474,7 +2606,15 @@
         </w:rPr>
       </w:pPr>
       <w:r>
-        <w:t>展示页设置分为：</w:t>
+        <w:t>展示</w:t>
+      </w:r>
+      <w:proofErr w:type="gramStart"/>
+      <w:r>
+        <w:t>页设置</w:t>
+      </w:r>
+      <w:proofErr w:type="gramEnd"/>
+      <w:r>
+        <w:t>分为：</w:t>
       </w:r>
     </w:p>
     <w:p>
@@ -2545,7 +2685,15 @@
         </w:rPr>
       </w:pPr>
       <w:r>
-        <w:t>用于设置展示页背景、背景图层、BP 框位置等内容。</w:t>
+        <w:t xml:space="preserve">用于设置展示页背景、背景图层、BP </w:t>
+      </w:r>
+      <w:proofErr w:type="gramStart"/>
+      <w:r>
+        <w:t>框位置</w:t>
+      </w:r>
+      <w:proofErr w:type="gramEnd"/>
+      <w:r>
+        <w:t>等内容。</w:t>
       </w:r>
     </w:p>
     <w:p>
@@ -2590,7 +2738,63 @@
         <w:rPr>
           <w:rFonts w:hint="eastAsia"/>
         </w:rPr>
-        <w:t>左侧竖列为背景设置。顶图，背景，槽位底图均在此设置。勾选 显示 即可看见该图片在预览展示页中的位置。可以调整图片的大小，位置，缩放，透明度以及图层。图层高的可以覆盖图层低的。</w:t>
+        <w:t>左侧</w:t>
+      </w:r>
+      <w:proofErr w:type="gramStart"/>
+      <w:r>
+        <w:rPr>
+          <w:rFonts w:hint="eastAsia"/>
+        </w:rPr>
+        <w:t>竖</w:t>
+      </w:r>
+      <w:proofErr w:type="gramEnd"/>
+      <w:r>
+        <w:rPr>
+          <w:rFonts w:hint="eastAsia"/>
+        </w:rPr>
+        <w:t>列为背景设置。顶图，背景，槽位底图均在此设置。</w:t>
+      </w:r>
+      <w:proofErr w:type="gramStart"/>
+      <w:r>
+        <w:rPr>
+          <w:rFonts w:hint="eastAsia"/>
+        </w:rPr>
+        <w:t>勾选</w:t>
+      </w:r>
+      <w:proofErr w:type="gramEnd"/>
+      <w:r>
+        <w:rPr>
+          <w:rFonts w:hint="eastAsia"/>
+        </w:rPr>
+        <w:t xml:space="preserve"> 显示 即可看见</w:t>
+      </w:r>
+      <w:proofErr w:type="gramStart"/>
+      <w:r>
+        <w:rPr>
+          <w:rFonts w:hint="eastAsia"/>
+        </w:rPr>
+        <w:t>该图片</w:t>
+      </w:r>
+      <w:proofErr w:type="gramEnd"/>
+      <w:r>
+        <w:rPr>
+          <w:rFonts w:hint="eastAsia"/>
+        </w:rPr>
+        <w:t>在预览展示页中的位置。可以调整图片的大小，位置，缩放，透明度以及图层。图层高的可以</w:t>
+      </w:r>
+      <w:proofErr w:type="gramStart"/>
+      <w:r>
+        <w:rPr>
+          <w:rFonts w:hint="eastAsia"/>
+        </w:rPr>
+        <w:t>覆盖图层低</w:t>
+      </w:r>
+      <w:proofErr w:type="gramEnd"/>
+      <w:r>
+        <w:rPr>
+          <w:rFonts w:hint="eastAsia"/>
+        </w:rPr>
+        <w:t>的。</w:t>
       </w:r>
     </w:p>
     <w:p>
@@ -2606,7 +2810,35 @@
         <w:rPr>
           <w:rFonts w:hint="eastAsia"/>
         </w:rPr>
-        <w:t>在调整好图片位置大小后，通常取消勾选 显示 ，因为大多数图片不会在一开始就显示，而是随着BP流程的推进逐步显示。因此一开始需要隐藏图片，并且在后续 变化设置 中通过响应事件而调整出现的时机。</w:t>
+        <w:t>在调整</w:t>
+      </w:r>
+      <w:proofErr w:type="gramStart"/>
+      <w:r>
+        <w:rPr>
+          <w:rFonts w:hint="eastAsia"/>
+        </w:rPr>
+        <w:t>好图片</w:t>
+      </w:r>
+      <w:proofErr w:type="gramEnd"/>
+      <w:r>
+        <w:rPr>
+          <w:rFonts w:hint="eastAsia"/>
+        </w:rPr>
+        <w:t>位置大小后，通常</w:t>
+      </w:r>
+      <w:proofErr w:type="gramStart"/>
+      <w:r>
+        <w:rPr>
+          <w:rFonts w:hint="eastAsia"/>
+        </w:rPr>
+        <w:t>取消勾选</w:t>
+      </w:r>
+      <w:proofErr w:type="gramEnd"/>
+      <w:r>
+        <w:rPr>
+          <w:rFonts w:hint="eastAsia"/>
+        </w:rPr>
+        <w:t xml:space="preserve"> 显示 ，因为大多数图片不会在一开始就显示，而是随着BP流程的推进逐步显示。因此一开始需要隐藏图片，并且在后续 变化设置 中通过响应事件而调整出现的时机。</w:t>
       </w:r>
     </w:p>
     <w:p>
@@ -2950,7 +3182,21 @@
         <w:rPr>
           <w:rFonts w:hint="eastAsia"/>
         </w:rPr>
-        <w:t>Ban槽位的间距选项不生效，用下方的间距1于间距2分别调控这一组槽位内部的间距。</w:t>
+        <w:t>Ban槽位的间距选项不生效，用下方的间距1于间距2分别调控这一组槽</w:t>
+      </w:r>
+      <w:proofErr w:type="gramStart"/>
+      <w:r>
+        <w:rPr>
+          <w:rFonts w:hint="eastAsia"/>
+        </w:rPr>
+        <w:t>位内部</w:t>
+      </w:r>
+      <w:proofErr w:type="gramEnd"/>
+      <w:r>
+        <w:rPr>
+          <w:rFonts w:hint="eastAsia"/>
+        </w:rPr>
+        <w:t>的间距。</w:t>
       </w:r>
     </w:p>
     <w:p>
@@ -3523,7 +3769,21 @@
         <w:rPr>
           <w:rFonts w:hint="eastAsia"/>
         </w:rPr>
-        <w:t>：点击-&gt;双方保护结束-&gt;触发保护相关特效，音效，触发protect_end事件</w:t>
+        <w:t>：点击-&gt;双方保护结束-&gt;触发保护相关特效，音效，触发</w:t>
+      </w:r>
+      <w:proofErr w:type="spellStart"/>
+      <w:r>
+        <w:rPr>
+          <w:rFonts w:hint="eastAsia"/>
+        </w:rPr>
+        <w:t>protect_end</w:t>
+      </w:r>
+      <w:proofErr w:type="spellEnd"/>
+      <w:r>
+        <w:rPr>
+          <w:rFonts w:hint="eastAsia"/>
+        </w:rPr>
+        <w:t>事件</w:t>
       </w:r>
     </w:p>
     <w:p>
@@ -3543,20 +3803,48 @@
         <w:rPr>
           <w:rFonts w:hint="eastAsia"/>
         </w:rPr>
-        <w:t>：点击-&gt;双方租借结束-&gt;触发租借相关特效，音效，触发hire_end事件</w:t>
-      </w:r>
-    </w:p>
-    <w:p>
-      <w:pPr>
-        <w:rPr>
-          <w:rFonts w:hint="eastAsia"/>
-        </w:rPr>
-      </w:pPr>
-      <w:r>
-        <w:rPr>
-          <w:rFonts w:hint="eastAsia"/>
-        </w:rPr>
-        <w:t>租借图:响应hire_end事件，开始变化，选定图片以延展方式出现，耗时5000ms</w:t>
+        <w:t>：点击-&gt;双方租借结束-&gt;触发租借相关特效，音效，触发</w:t>
+      </w:r>
+      <w:proofErr w:type="spellStart"/>
+      <w:r>
+        <w:rPr>
+          <w:rFonts w:hint="eastAsia"/>
+        </w:rPr>
+        <w:t>hire_end</w:t>
+      </w:r>
+      <w:proofErr w:type="spellEnd"/>
+      <w:r>
+        <w:rPr>
+          <w:rFonts w:hint="eastAsia"/>
+        </w:rPr>
+        <w:t>事件</w:t>
+      </w:r>
+    </w:p>
+    <w:p>
+      <w:pPr>
+        <w:rPr>
+          <w:rFonts w:hint="eastAsia"/>
+        </w:rPr>
+      </w:pPr>
+      <w:r>
+        <w:rPr>
+          <w:rFonts w:hint="eastAsia"/>
+        </w:rPr>
+        <w:t>租借图:响应</w:t>
+      </w:r>
+      <w:proofErr w:type="spellStart"/>
+      <w:r>
+        <w:rPr>
+          <w:rFonts w:hint="eastAsia"/>
+        </w:rPr>
+        <w:t>hire_end</w:t>
+      </w:r>
+      <w:proofErr w:type="spellEnd"/>
+      <w:r>
+        <w:rPr>
+          <w:rFonts w:hint="eastAsia"/>
+        </w:rPr>
+        <w:t>事件，开始变化，选定图片以延展方式出现，耗时5000ms</w:t>
       </w:r>
     </w:p>
     <w:p>
@@ -4179,7 +4467,25 @@
           <w:b/>
           <w:bCs/>
         </w:rPr>
-        <w:t>事件后延迟激活请按照图中设置</w:t>
+        <w:t>事件后延迟</w:t>
+      </w:r>
+      <w:proofErr w:type="gramStart"/>
+      <w:r>
+        <w:rPr>
+          <w:rFonts w:hint="eastAsia"/>
+          <w:b/>
+          <w:bCs/>
+        </w:rPr>
+        <w:t>激活请</w:t>
+      </w:r>
+      <w:proofErr w:type="gramEnd"/>
+      <w:r>
+        <w:rPr>
+          <w:rFonts w:hint="eastAsia"/>
+          <w:b/>
+          <w:bCs/>
+        </w:rPr>
+        <w:t>按照图中设置</w:t>
       </w:r>
     </w:p>
     <w:p>
@@ -4306,7 +4612,15 @@
         </w:rPr>
       </w:pPr>
       <w:r>
-        <w:t>点击“打开预览页面”后，会打开独立预览窗口。预览页用于检查展示页布局和效果。</w:t>
+        <w:t>点击“打开预览页面”后，会打开独立预览窗口。预览</w:t>
+      </w:r>
+      <w:proofErr w:type="gramStart"/>
+      <w:r>
+        <w:t>页用于</w:t>
+      </w:r>
+      <w:proofErr w:type="gramEnd"/>
+      <w:r>
+        <w:t>检查展示页布局和效果。</w:t>
       </w:r>
     </w:p>
     <w:p>
@@ -4548,7 +4862,15 @@
         </w:rPr>
       </w:pPr>
       <w:r>
-        <w:t>4. 正式展示页会以独立窗口打开。</w:t>
+        <w:t>4. 正式</w:t>
+      </w:r>
+      <w:proofErr w:type="gramStart"/>
+      <w:r>
+        <w:t>展示页会以</w:t>
+      </w:r>
+      <w:proofErr w:type="gramEnd"/>
+      <w:r>
+        <w:t>独立窗口打开。</w:t>
       </w:r>
     </w:p>
     <w:p>
@@ -4762,7 +5084,15 @@
         </w:rPr>
       </w:pPr>
       <w:r>
-        <w:t>配音轴用于把一段配音音频和已保存的 BP 结果对齐，并驱动展示页自动推进。</w:t>
+        <w:t>配音</w:t>
+      </w:r>
+      <w:proofErr w:type="gramStart"/>
+      <w:r>
+        <w:t>轴用于</w:t>
+      </w:r>
+      <w:proofErr w:type="gramEnd"/>
+      <w:r>
+        <w:t>把一段配音音频和已保存的 BP 结果对齐，并驱动展示页自动推进。</w:t>
       </w:r>
     </w:p>
     <w:p>
@@ -4843,6 +5173,11 @@
       </w:r>
     </w:p>
     <w:p>
+      <w:pPr>
+        <w:rPr>
+          <w:rFonts w:hint="eastAsia"/>
+        </w:rPr>
+      </w:pPr>
       <w:r>
         <w:t>6. 点击“保存”。</w:t>
       </w:r>
@@ -4913,13 +5248,23 @@
         </w:rPr>
         <w:t>注：</w:t>
       </w:r>
+      <w:proofErr w:type="gramStart"/>
       <w:r>
         <w:rPr>
           <w:rFonts w:hint="eastAsia"/>
           <w:b/>
           <w:bCs/>
         </w:rPr>
-        <w:t>当事件轴下方出现橙色的字，提示请插入额外点击时，需要点击右上角插入额外点击</w:t>
+        <w:t>当事件轴</w:t>
+      </w:r>
+      <w:proofErr w:type="gramEnd"/>
+      <w:r>
+        <w:rPr>
+          <w:rFonts w:hint="eastAsia"/>
+          <w:b/>
+          <w:bCs/>
+        </w:rPr>
+        <w:t>下方出现橙色的字，提示请插入额外点击时，需要点击右上角插入额外点击</w:t>
       </w:r>
     </w:p>
     <w:p>
@@ -5021,12 +5366,29 @@
       </w:r>
     </w:p>
     <w:p>
+      <w:pPr>
+        <w:rPr>
+          <w:rFonts w:hint="eastAsia"/>
+        </w:rPr>
+      </w:pPr>
       <w:r>
         <w:t>4. 点击“打开展示页”。</w:t>
       </w:r>
     </w:p>
-    <w:p/>
-    <w:p/>
+    <w:p>
+      <w:pPr>
+        <w:rPr>
+          <w:rFonts w:hint="eastAsia"/>
+        </w:rPr>
+      </w:pPr>
+    </w:p>
+    <w:p>
+      <w:pPr>
+        <w:rPr>
+          <w:rFonts w:hint="eastAsia"/>
+        </w:rPr>
+      </w:pPr>
+    </w:p>
     <w:p>
       <w:pPr>
         <w:rPr>

</xml_diff>